<commit_message>
Update 3 Système 3D Complet
</commit_message>
<xml_diff>
--- a/Base/principe.docx
+++ b/Base/principe.docx
@@ -3,47 +3,34 @@
 <w:document xmlns:wpc="http://schemas.microsoft.com/office/word/2010/wordprocessingCanvas" xmlns:cx="http://schemas.microsoft.com/office/drawing/2014/chartex" xmlns:cx1="http://schemas.microsoft.com/office/drawing/2015/9/8/chartex" xmlns:cx2="http://schemas.microsoft.com/office/drawing/2015/10/21/chartex" xmlns:cx3="http://schemas.microsoft.com/office/drawing/2016/5/9/chartex" xmlns:cx4="http://schemas.microsoft.com/office/drawing/2016/5/10/chartex" xmlns:cx5="http://schemas.microsoft.com/office/drawing/2016/5/11/chartex" xmlns:cx6="http://schemas.microsoft.com/office/drawing/2016/5/12/chartex" xmlns:cx7="http://schemas.microsoft.com/office/drawing/2016/5/13/chartex" xmlns:cx8="http://schemas.microsoft.com/office/drawing/2016/5/14/chartex" xmlns:mc="http://schemas.openxmlformats.org/markup-compatibility/2006" xmlns:aink="http://schemas.microsoft.com/office/drawing/2016/ink" xmlns:am3d="http://schemas.microsoft.com/office/drawing/2017/model3d" xmlns:o="urn:schemas-microsoft-com:office:office" xmlns:oel="http://schemas.microsoft.com/office/2019/extlst" xmlns:r="http://schemas.openxmlformats.org/officeDocument/2006/relationships" xmlns:m="http://schemas.openxmlformats.org/officeDocument/2006/math" xmlns:v="urn:schemas-microsoft-com:vml" xmlns:wp14="http://schemas.microsoft.com/office/word/2010/wordprocessingDrawing" xmlns:wp="http://schemas.openxmlformats.org/drawingml/2006/wordprocessingDrawing" xmlns:w10="urn:schemas-microsoft-com:office:word" xmlns:w="http://schemas.openxmlformats.org/wordprocessingml/2006/main" xmlns:w14="http://schemas.microsoft.com/office/word/2010/wordml" xmlns:w15="http://schemas.microsoft.com/office/word/2012/wordml" xmlns:w16cex="http://schemas.microsoft.com/office/word/2018/wordml/cex" xmlns:w16cid="http://schemas.microsoft.com/office/word/2016/wordml/cid" xmlns:w16="http://schemas.microsoft.com/office/word/2018/wordml" xmlns:w16du="http://schemas.microsoft.com/office/word/2023/wordml/word16du" xmlns:w16sdtdh="http://schemas.microsoft.com/office/word/2020/wordml/sdtdatahash" xmlns:w16sdtfl="http://schemas.microsoft.com/office/word/2024/wordml/sdtformatlock" xmlns:w16se="http://schemas.microsoft.com/office/word/2015/wordml/symex" xmlns:wpg="http://schemas.microsoft.com/office/word/2010/wordprocessingGroup" xmlns:wpi="http://schemas.microsoft.com/office/word/2010/wordprocessingInk" xmlns:wne="http://schemas.microsoft.com/office/word/2006/wordml" xmlns:wps="http://schemas.microsoft.com/office/word/2010/wordprocessingShape" mc:Ignorable="w14 w15 w16se w16cid w16 w16cex w16sdtdh w16sdtfl w16du wp14">
   <w:body>
     <w:p>
+      <w:pPr>
+        <w:jc w:val="center"/>
+        <w:rPr>
+          <w:b/>
+          <w:bCs/>
+        </w:rPr>
+      </w:pPr>
+      <w:r>
+        <w:rPr>
+          <w:b/>
+          <w:bCs/>
+        </w:rPr>
+        <w:t>FAUNEX</w:t>
+      </w:r>
+    </w:p>
+    <w:p>
       <w:r>
         <w:t>Un jeu à but éducatif :</w:t>
       </w:r>
     </w:p>
     <w:p>
       <w:r>
-        <w:t xml:space="preserve">Le joueur explore </w:t>
-      </w:r>
-      <w:proofErr w:type="spellStart"/>
-      <w:r>
-        <w:t>différnest</w:t>
-      </w:r>
-      <w:proofErr w:type="spellEnd"/>
-      <w:r>
-        <w:t xml:space="preserve"> biomes et prends en photo la faune et la flore et réponds à des </w:t>
-      </w:r>
-      <w:proofErr w:type="spellStart"/>
-      <w:r>
-        <w:t>questiosn</w:t>
-      </w:r>
-      <w:proofErr w:type="spellEnd"/>
-      <w:r>
-        <w:t xml:space="preserve"> puis peut l’ajouter à son système d’</w:t>
-      </w:r>
-      <w:proofErr w:type="spellStart"/>
-      <w:r>
-        <w:t>achievement</w:t>
-      </w:r>
-      <w:proofErr w:type="spellEnd"/>
-    </w:p>
-    <w:p>
-      <w:r>
-        <w:t xml:space="preserve">Des </w:t>
-      </w:r>
-      <w:proofErr w:type="spellStart"/>
-      <w:r>
-        <w:t>perssonages</w:t>
-      </w:r>
-      <w:proofErr w:type="spellEnd"/>
-      <w:r>
-        <w:t>/animaux peuvent venir le voir…</w:t>
+        <w:t>Le joueur explore différnest biomes et prends en photo la faune et la flore et réponds à des questiosn puis peut l’ajouter à son système d’achievement</w:t>
+      </w:r>
+    </w:p>
+    <w:p>
+      <w:r>
+        <w:t>Des perssonages/animaux peuvent venir le voir…</w:t>
       </w:r>
     </w:p>
     <w:p/>
@@ -61,28 +48,12 @@
     </w:p>
     <w:p>
       <w:r>
-        <w:t xml:space="preserve">Mise au Point (Focus) : Un mini-jeu de </w:t>
-      </w:r>
-      <w:proofErr w:type="gramStart"/>
-      <w:r>
-        <w:t>timing</w:t>
-      </w:r>
-      <w:proofErr w:type="gramEnd"/>
-      <w:r>
-        <w:t xml:space="preserve"> où il faut stabiliser l'image pour qu'elle soit nette.</w:t>
-      </w:r>
-    </w:p>
-    <w:p>
-      <w:r>
-        <w:t>Algorithme de Notation : Le jeu note la photo selon le centrage, la taille du sujet et la rareté (</w:t>
-      </w:r>
-      <w:proofErr w:type="gramStart"/>
-      <w:r>
-        <w:t>ex:</w:t>
-      </w:r>
-      <w:proofErr w:type="gramEnd"/>
-      <w:r>
-        <w:t xml:space="preserve"> "Cadrage parfait : +50 XP").</w:t>
+        <w:t>Mise au Point (Focus) : Un mini-jeu de timing où il faut stabiliser l'image pour qu'elle soit nette.</w:t>
+      </w:r>
+    </w:p>
+    <w:p>
+      <w:r>
+        <w:t>Algorithme de Notation : Le jeu note la photo selon le centrage, la taille du sujet et la rareté (ex: "Cadrage parfait : +50 XP").</w:t>
       </w:r>
     </w:p>
     <w:p>
@@ -92,11 +63,6 @@
     </w:p>
     <w:p>
       <w:r>
-        <w:t>Infrarouge déblocable</w:t>
-      </w:r>
-    </w:p>
-    <w:p>
-      <w:r>
         <w:t>Flash</w:t>
       </w:r>
       <w:r>
@@ -108,58 +74,17 @@
     </w:p>
     <w:p>
       <w:r>
-        <w:t>Mode "Selfie" : Prendre une photo de son avatar avec l'animal (bonus de risque).</w:t>
-      </w:r>
-    </w:p>
-    <w:p>
-      <w:r>
-        <w:t>Caméra de chasse/piège photo</w:t>
-      </w:r>
-    </w:p>
-    <w:p>
-      <w:r>
         <w:t>Système de Biomes : Forêt tempérée, Désert aride, Marais, Toundra, Récif corallien.</w:t>
       </w:r>
     </w:p>
     <w:p>
       <w:r>
-        <w:t>Cycle Jour/Nuit : La faune change (</w:t>
-      </w:r>
-      <w:proofErr w:type="gramStart"/>
-      <w:r>
-        <w:t>ex:</w:t>
-      </w:r>
-      <w:proofErr w:type="gramEnd"/>
-      <w:r>
-        <w:t xml:space="preserve"> hiboux et chauves-souris la nuit, oiseaux le jour).</w:t>
-      </w:r>
-    </w:p>
-    <w:p>
-      <w:r>
-        <w:t>Météo Dynamique : La pluie fait sortir les escargots et les grenouilles mais cache les papillons.</w:t>
-      </w:r>
-    </w:p>
-    <w:p>
-      <w:r>
         <w:t>Pistes et Empreintes : Des traces au sol indiques la direction d'un animal rare.</w:t>
       </w:r>
     </w:p>
     <w:p>
       <w:r>
-        <w:t>Obstacles Naturels : Troncs d'arbres ou rivières nécessitant des bottes ou une hache (déblocables) pour passer.</w:t>
-      </w:r>
-    </w:p>
-    <w:p>
-      <w:r>
-        <w:t>Carte Interactive : Une "</w:t>
-      </w:r>
-      <w:proofErr w:type="spellStart"/>
-      <w:r>
-        <w:t>Minimap</w:t>
-      </w:r>
-      <w:proofErr w:type="spellEnd"/>
-      <w:r>
-        <w:t>" qui se dessine au fur et à mesure de l'exploration ("Brouillard de guerre").</w:t>
+        <w:t>Carte Interactive : Une "Minimap" qui se dessine au fur et à mesure de l'exploration ("Brouillard de guerre").</w:t>
       </w:r>
     </w:p>
     <w:p>
@@ -169,20 +94,7 @@
     </w:p>
     <w:p>
       <w:r>
-        <w:t>Quiz Contextuel : Après une photo, une question apparaît (</w:t>
-      </w:r>
-      <w:proofErr w:type="gramStart"/>
-      <w:r>
-        <w:t>ex:</w:t>
-      </w:r>
-      <w:proofErr w:type="gramEnd"/>
-      <w:r>
-        <w:t xml:space="preserve"> "Quel est le régime alimentaire de cet animal ?").</w:t>
-      </w:r>
-    </w:p>
-    <w:p>
-      <w:r>
-        <w:t>Identification Sonore : Un mini-jeu où l'on entend un cri et on doit choisir le bon animal.</w:t>
+        <w:t>Quiz Contextuel : Après une photo, une question apparaît (ex: "Quel est le régime alimentaire de cet animal ?").</w:t>
       </w:r>
     </w:p>
     <w:p>
@@ -192,36 +104,12 @@
     </w:p>
     <w:p>
       <w:r>
-        <w:t>Défis Botanique : Identifier les plantes médicinales vs plantes toxiques.</w:t>
-      </w:r>
-    </w:p>
-    <w:p>
-      <w:r>
-        <w:t>Correction d'Erreurs : Des PNJ donnent de fausses infos, le joueur doit prouver le contraire avec une photo.</w:t>
-      </w:r>
-    </w:p>
-    <w:p>
-      <w:r>
-        <w:lastRenderedPageBreak/>
-        <w:t>Laboratoire d'Analyse : Retourner au QG pour analyser des échantillons (plumes, crottes) trouvés au sol.</w:t>
-      </w:r>
-    </w:p>
-    <w:p>
-      <w:r>
-        <w:t>Sensibilisation Écologique : Bonus de points si le joueur photographie (et ramasse via un clic) des déchets dans la nature.</w:t>
-      </w:r>
-    </w:p>
-    <w:p>
-      <w:r>
-        <w:t>Badges/Succès (</w:t>
-      </w:r>
-      <w:proofErr w:type="spellStart"/>
-      <w:r>
-        <w:t>Achievements</w:t>
-      </w:r>
-      <w:proofErr w:type="spellEnd"/>
-      <w:r>
-        <w:t>) : "A photographié 10 oiseaux", "A trouvé l'animal légendaire".</w:t>
+        <w:t>Sensibilisation Écologique : Bonus de points si le joueur ramasse via un clic des déchets dans la nature.</w:t>
+      </w:r>
+    </w:p>
+    <w:p>
+      <w:r>
+        <w:t>Badges/Succès (Achievements) : "A photographié 10 oiseaux", "A trouvé l'animal légendaire".</w:t>
       </w:r>
     </w:p>
     <w:p>
@@ -236,15 +124,7 @@
     </w:p>
     <w:p>
       <w:r>
-        <w:t>Tableau de Chasse (Pacifique) : Liste des espèces restantes à découvrir dans la zone (</w:t>
-      </w:r>
-      <w:proofErr w:type="gramStart"/>
-      <w:r>
-        <w:t>ex:</w:t>
-      </w:r>
-      <w:proofErr w:type="gramEnd"/>
-      <w:r>
-        <w:t xml:space="preserve"> 4/10 trouvés).</w:t>
+        <w:t>Tableau de Chasse (Pacifique) : Liste des espèces restantes à découvrir dans la zone (ex: 4/10 trouvés).</w:t>
       </w:r>
     </w:p>
     <w:p>
@@ -266,11 +146,6 @@
     <w:p>
       <w:r>
         <w:t>Le Garde Forestier (Guide) : Donne des missions et des tutoriels.</w:t>
-      </w:r>
-    </w:p>
-    <w:p>
-      <w:r>
-        <w:t>Le Touriste Perdu : PNJ aléatoire à aider pour gagner de la réputation.</w:t>
       </w:r>
     </w:p>
     <w:p>
@@ -820,6 +695,14 @@
   <w:style w:type="paragraph" w:default="1" w:styleId="Normal">
     <w:name w:val="Normal"/>
     <w:qFormat/>
+    <w:rsid w:val="00E80204"/>
+    <w:pPr>
+      <w:spacing w:line="259" w:lineRule="auto"/>
+    </w:pPr>
+    <w:rPr>
+      <w:sz w:val="22"/>
+      <w:szCs w:val="22"/>
+    </w:rPr>
   </w:style>
   <w:style w:type="paragraph" w:styleId="Titre1">
     <w:name w:val="heading 1"/>
@@ -1023,6 +906,7 @@
   <w:style w:type="character" w:default="1" w:styleId="Policepardfaut">
     <w:name w:val="Default Paragraph Font"/>
     <w:uiPriority w:val="1"/>
+    <w:semiHidden/>
     <w:unhideWhenUsed/>
   </w:style>
   <w:style w:type="table" w:default="1" w:styleId="TableauNormal">
@@ -1334,6 +1218,34 @@
       <w:smallCaps/>
       <w:color w:val="0F4761" w:themeColor="accent1" w:themeShade="BF"/>
       <w:spacing w:val="5"/>
+    </w:rPr>
+  </w:style>
+  <w:style w:type="paragraph" w:customStyle="1" w:styleId="Studys">
+    <w:name w:val="Studys"/>
+    <w:basedOn w:val="Normal"/>
+    <w:link w:val="StudysCar"/>
+    <w:qFormat/>
+    <w:rsid w:val="00AB2562"/>
+    <w:pPr>
+      <w:spacing w:line="480" w:lineRule="auto"/>
+      <w:jc w:val="both"/>
+    </w:pPr>
+    <w:rPr>
+      <w:rFonts w:ascii="Arial" w:hAnsi="Arial" w:cs="Arial"/>
+      <w:color w:val="000000"/>
+      <w:sz w:val="40"/>
+    </w:rPr>
+  </w:style>
+  <w:style w:type="character" w:customStyle="1" w:styleId="StudysCar">
+    <w:name w:val="Studys Car"/>
+    <w:basedOn w:val="Policepardfaut"/>
+    <w:link w:val="Studys"/>
+    <w:rsid w:val="00AB2562"/>
+    <w:rPr>
+      <w:rFonts w:ascii="Arial" w:hAnsi="Arial" w:cs="Arial"/>
+      <w:color w:val="000000"/>
+      <w:sz w:val="40"/>
+      <w:szCs w:val="22"/>
     </w:rPr>
   </w:style>
 </w:styles>

</xml_diff>